<commit_message>
Drop the "No plan in your pack?" line and name PUBLIC as a partner
The posters no longer carry the no-plan line, and the delay guide and
posters now say they are run by IFF Research, PUBLIC and the
University of Cambridge.

Co-Authored-By: Claude Opus 5.5 <noreply@anthropic.com>
Claude-Session: https://claude.ai/code/session_016H7YrYonBx6jmZR5jhsdms
</commit_message>
<xml_diff>
--- a/exports/posters/SMART-poster-both.docx
+++ b/exports/posters/SMART-poster-both.docx
@@ -353,17 +353,8 @@
     </w:tbl>
     <w:p>
       <w:pPr>
-        <w:spacing w:after="400" w:before="120"/>
-      </w:pPr>
-      <w:r>
-        <w:rPr>
-          <w:rFonts w:ascii="Arial" w:cs="Arial" w:eastAsia="Arial" w:hAnsi="Arial"/>
-          <w:color w:val="4A5B70"/>
-          <w:sz w:val="20"/>
-          <w:szCs w:val="20"/>
-        </w:rPr>
-        <w:t xml:space="preserve">No plan in your pack? You don't need to do anything.</w:t>
-      </w:r>
+        <w:spacing w:after="400"/>
+      </w:pPr>
     </w:p>
     <w:tbl>
       <w:tblPr>
@@ -696,7 +687,7 @@
           <w:sz w:val="17"/>
           <w:szCs w:val="17"/>
         </w:rPr>
-        <w:t xml:space="preserve">Run by IFF Research and the University of Cambridge for the Department for Education.</w:t>
+        <w:t xml:space="preserve">Run by IFF Research, PUBLIC and the University of Cambridge for the Department for Education.</w:t>
       </w:r>
     </w:p>
     <w:sectPr>

</xml_diff>